<commit_message>
Se le modifico apariencia al logo, trasnparencia y color
</commit_message>
<xml_diff>
--- a/trimestre 2/FIGMA.docx
+++ b/trimestre 2/FIGMA.docx
@@ -1,6 +1,6 @@
 
 <file path=word/document.xml><?xml version="1.0" encoding="utf-8"?>
-<w:document xmlns:wpc="http://schemas.microsoft.com/office/word/2010/wordprocessingCanvas" xmlns:cx="http://schemas.microsoft.com/office/drawing/2014/chartex" xmlns:cx1="http://schemas.microsoft.com/office/drawing/2015/9/8/chartex" xmlns:cx2="http://schemas.microsoft.com/office/drawing/2015/10/21/chartex" xmlns:cx3="http://schemas.microsoft.com/office/drawing/2016/5/9/chartex" xmlns:cx4="http://schemas.microsoft.com/office/drawing/2016/5/10/chartex" xmlns:cx5="http://schemas.microsoft.com/office/drawing/2016/5/11/chartex" xmlns:cx6="http://schemas.microsoft.com/office/drawing/2016/5/12/chartex" xmlns:cx7="http://schemas.microsoft.com/office/drawing/2016/5/13/chartex" xmlns:cx8="http://schemas.microsoft.com/office/drawing/2016/5/14/chartex" xmlns:mc="http://schemas.openxmlformats.org/markup-compatibility/2006" xmlns:aink="http://schemas.microsoft.com/office/drawing/2016/ink" xmlns:am3d="http://schemas.microsoft.com/office/drawing/2017/model3d" xmlns:o="urn:schemas-microsoft-com:office:office" xmlns:oel="http://schemas.microsoft.com/office/2019/extlst" xmlns:r="http://schemas.openxmlformats.org/officeDocument/2006/relationships" xmlns:m="http://schemas.openxmlformats.org/officeDocument/2006/math" xmlns:v="urn:schemas-microsoft-com:vml" xmlns:wp14="http://schemas.microsoft.com/office/word/2010/wordprocessingDrawing" xmlns:wp="http://schemas.openxmlformats.org/drawingml/2006/wordprocessingDrawing" xmlns:w10="urn:schemas-microsoft-com:office:word" xmlns:w="http://schemas.openxmlformats.org/wordprocessingml/2006/main" xmlns:w14="http://schemas.microsoft.com/office/word/2010/wordml" xmlns:w15="http://schemas.microsoft.com/office/word/2012/wordml" xmlns:w16cex="http://schemas.microsoft.com/office/word/2018/wordml/cex" xmlns:w16cid="http://schemas.microsoft.com/office/word/2016/wordml/cid" xmlns:w16="http://schemas.microsoft.com/office/word/2018/wordml" xmlns:w16du="http://schemas.microsoft.com/office/word/2023/wordml/word16du" xmlns:w16sdtdh="http://schemas.microsoft.com/office/word/2020/wordml/sdtdatahash" xmlns:w16sdtfl="http://schemas.microsoft.com/office/word/2024/wordml/sdtformatlock" xmlns:w16se="http://schemas.microsoft.com/office/word/2015/wordml/symex" xmlns:wpg="http://schemas.microsoft.com/office/word/2010/wordprocessingGroup" xmlns:wpi="http://schemas.microsoft.com/office/word/2010/wordprocessingInk" xmlns:wne="http://schemas.microsoft.com/office/word/2006/wordml" xmlns:wps="http://schemas.microsoft.com/office/word/2010/wordprocessingShape" mc:Ignorable="w14 w15 w16se w16cid w16 w16cex w16sdtdh w16sdtfl w16du wp14">
+<w:document xmlns:wpc="http://schemas.microsoft.com/office/word/2010/wordprocessingCanvas" xmlns:cx="http://schemas.microsoft.com/office/drawing/2014/chartex" xmlns:cx1="http://schemas.microsoft.com/office/drawing/2015/9/8/chartex" xmlns:cx2="http://schemas.microsoft.com/office/drawing/2015/10/21/chartex" xmlns:cx3="http://schemas.microsoft.com/office/drawing/2016/5/9/chartex" xmlns:cx4="http://schemas.microsoft.com/office/drawing/2016/5/10/chartex" xmlns:cx5="http://schemas.microsoft.com/office/drawing/2016/5/11/chartex" xmlns:cx6="http://schemas.microsoft.com/office/drawing/2016/5/12/chartex" xmlns:cx7="http://schemas.microsoft.com/office/drawing/2016/5/13/chartex" xmlns:cx8="http://schemas.microsoft.com/office/drawing/2016/5/14/chartex" xmlns:mc="http://schemas.openxmlformats.org/markup-compatibility/2006" xmlns:aink="http://schemas.microsoft.com/office/drawing/2016/ink" xmlns:am3d="http://schemas.microsoft.com/office/drawing/2017/model3d" xmlns:o="urn:schemas-microsoft-com:office:office" xmlns:oel="http://schemas.microsoft.com/office/2019/extlst" xmlns:r="http://schemas.openxmlformats.org/officeDocument/2006/relationships" xmlns:m="http://schemas.openxmlformats.org/officeDocument/2006/math" xmlns:v="urn:schemas-microsoft-com:vml" xmlns:wp14="http://schemas.microsoft.com/office/word/2010/wordprocessingDrawing" xmlns:wp="http://schemas.openxmlformats.org/drawingml/2006/wordprocessingDrawing" xmlns:w10="urn:schemas-microsoft-com:office:word" xmlns:w="http://schemas.openxmlformats.org/wordprocessingml/2006/main" xmlns:w14="http://schemas.microsoft.com/office/word/2010/wordml" xmlns:w15="http://schemas.microsoft.com/office/word/2012/wordml" xmlns:w16cex="http://schemas.microsoft.com/office/word/2018/wordml/cex" xmlns:w16cid="http://schemas.microsoft.com/office/word/2016/wordml/cid" xmlns:w16="http://schemas.microsoft.com/office/word/2018/wordml" xmlns:w16sdtdh="http://schemas.microsoft.com/office/word/2020/wordml/sdtdatahash" xmlns:w16se="http://schemas.microsoft.com/office/word/2015/wordml/symex" xmlns:wpg="http://schemas.microsoft.com/office/word/2010/wordprocessingGroup" xmlns:wpi="http://schemas.microsoft.com/office/word/2010/wordprocessingInk" xmlns:wne="http://schemas.microsoft.com/office/word/2006/wordml" xmlns:wps="http://schemas.microsoft.com/office/word/2010/wordprocessingShape" mc:Ignorable="w14 w15 w16se w16cid w16 w16cex w16sdtdh wp14">
   <w:body>
     <w:p>
       <w:pPr>
@@ -90,6 +90,7 @@
     <w:p>
       <w:pPr>
         <w:rPr>
+          <w:rStyle w:val="Hipervnculo"/>
           <w:b/>
           <w:bCs/>
         </w:rPr>
@@ -111,6 +112,80 @@
           <w:t>https://www.figma.com/make/x1ggvgw2lrvoCOx5JtN7se/Agregar-calendario-de-citas?t=iFkfQSNzYofEfUHE-1</w:t>
         </w:r>
       </w:hyperlink>
+    </w:p>
+    <w:p>
+      <w:pPr>
+        <w:rPr>
+          <w:b/>
+          <w:bCs/>
+        </w:rPr>
+      </w:pPr>
+    </w:p>
+    <w:p>
+      <w:pPr>
+        <w:rPr>
+          <w:b/>
+          <w:bCs/>
+        </w:rPr>
+      </w:pPr>
+      <w:r>
+        <w:rPr>
+          <w:b/>
+          <w:bCs/>
+        </w:rPr>
+        <w:t xml:space="preserve">12 de </w:t>
+      </w:r>
+      <w:proofErr w:type="gramStart"/>
+      <w:r>
+        <w:rPr>
+          <w:b/>
+          <w:bCs/>
+        </w:rPr>
+        <w:t>Marzo</w:t>
+      </w:r>
+      <w:proofErr w:type="gramEnd"/>
+      <w:r>
+        <w:rPr>
+          <w:b/>
+          <w:bCs/>
+        </w:rPr>
+        <w:t xml:space="preserve"> de 2026</w:t>
+      </w:r>
+    </w:p>
+    <w:p>
+      <w:r>
+        <w:t>Se le modifico apariencia al logo</w:t>
+      </w:r>
+      <w:r>
+        <w:t>,</w:t>
+      </w:r>
+      <w:r>
+        <w:t xml:space="preserve"> transparencia y color. </w:t>
+      </w:r>
+    </w:p>
+    <w:p>
+      <w:pPr>
+        <w:rPr>
+          <w:b/>
+          <w:bCs/>
+        </w:rPr>
+      </w:pPr>
+      <w:r>
+        <w:rPr>
+          <w:b/>
+          <w:bCs/>
+        </w:rPr>
+        <w:t xml:space="preserve">URL:  </w:t>
+      </w:r>
+      <w:r>
+        <w:rPr>
+          <w:b/>
+          <w:bCs/>
+          <w:color w:val="0070C0"/>
+          <w:u w:val="single"/>
+        </w:rPr>
+        <w:t>https://www.figma.com/make/x1ggvgw2lrvoCOx5JtN7se/Agregar-calendario-de-citas?p=f&amp;t=91GrGoK9tRBytdE5-0</w:t>
+      </w:r>
     </w:p>
     <w:p>
       <w:pPr>
@@ -133,7 +208,7 @@
 </file>
 
 <file path=word/endnotes.xml><?xml version="1.0" encoding="utf-8"?>
-<w:endnotes xmlns:wpc="http://schemas.microsoft.com/office/word/2010/wordprocessingCanvas" xmlns:cx="http://schemas.microsoft.com/office/drawing/2014/chartex" xmlns:cx1="http://schemas.microsoft.com/office/drawing/2015/9/8/chartex" xmlns:cx2="http://schemas.microsoft.com/office/drawing/2015/10/21/chartex" xmlns:cx3="http://schemas.microsoft.com/office/drawing/2016/5/9/chartex" xmlns:cx4="http://schemas.microsoft.com/office/drawing/2016/5/10/chartex" xmlns:cx5="http://schemas.microsoft.com/office/drawing/2016/5/11/chartex" xmlns:cx6="http://schemas.microsoft.com/office/drawing/2016/5/12/chartex" xmlns:cx7="http://schemas.microsoft.com/office/drawing/2016/5/13/chartex" xmlns:cx8="http://schemas.microsoft.com/office/drawing/2016/5/14/chartex" xmlns:mc="http://schemas.openxmlformats.org/markup-compatibility/2006" xmlns:aink="http://schemas.microsoft.com/office/drawing/2016/ink" xmlns:am3d="http://schemas.microsoft.com/office/drawing/2017/model3d" xmlns:o="urn:schemas-microsoft-com:office:office" xmlns:oel="http://schemas.microsoft.com/office/2019/extlst" xmlns:r="http://schemas.openxmlformats.org/officeDocument/2006/relationships" xmlns:m="http://schemas.openxmlformats.org/officeDocument/2006/math" xmlns:v="urn:schemas-microsoft-com:vml" xmlns:wp14="http://schemas.microsoft.com/office/word/2010/wordprocessingDrawing" xmlns:wp="http://schemas.openxmlformats.org/drawingml/2006/wordprocessingDrawing" xmlns:w10="urn:schemas-microsoft-com:office:word" xmlns:w="http://schemas.openxmlformats.org/wordprocessingml/2006/main" xmlns:w14="http://schemas.microsoft.com/office/word/2010/wordml" xmlns:w15="http://schemas.microsoft.com/office/word/2012/wordml" xmlns:w16cex="http://schemas.microsoft.com/office/word/2018/wordml/cex" xmlns:w16cid="http://schemas.microsoft.com/office/word/2016/wordml/cid" xmlns:w16="http://schemas.microsoft.com/office/word/2018/wordml" xmlns:w16du="http://schemas.microsoft.com/office/word/2023/wordml/word16du" xmlns:w16sdtdh="http://schemas.microsoft.com/office/word/2020/wordml/sdtdatahash" xmlns:w16sdtfl="http://schemas.microsoft.com/office/word/2024/wordml/sdtformatlock" xmlns:w16se="http://schemas.microsoft.com/office/word/2015/wordml/symex" xmlns:wpg="http://schemas.microsoft.com/office/word/2010/wordprocessingGroup" xmlns:wpi="http://schemas.microsoft.com/office/word/2010/wordprocessingInk" xmlns:wne="http://schemas.microsoft.com/office/word/2006/wordml" xmlns:wps="http://schemas.microsoft.com/office/word/2010/wordprocessingShape" mc:Ignorable="w14 w15 w16se w16cid w16 w16cex w16sdtdh w16sdtfl w16du wp14">
+<w:endnotes xmlns:wpc="http://schemas.microsoft.com/office/word/2010/wordprocessingCanvas" xmlns:cx="http://schemas.microsoft.com/office/drawing/2014/chartex" xmlns:cx1="http://schemas.microsoft.com/office/drawing/2015/9/8/chartex" xmlns:cx2="http://schemas.microsoft.com/office/drawing/2015/10/21/chartex" xmlns:cx3="http://schemas.microsoft.com/office/drawing/2016/5/9/chartex" xmlns:cx4="http://schemas.microsoft.com/office/drawing/2016/5/10/chartex" xmlns:cx5="http://schemas.microsoft.com/office/drawing/2016/5/11/chartex" xmlns:cx6="http://schemas.microsoft.com/office/drawing/2016/5/12/chartex" xmlns:cx7="http://schemas.microsoft.com/office/drawing/2016/5/13/chartex" xmlns:cx8="http://schemas.microsoft.com/office/drawing/2016/5/14/chartex" xmlns:mc="http://schemas.openxmlformats.org/markup-compatibility/2006" xmlns:aink="http://schemas.microsoft.com/office/drawing/2016/ink" xmlns:am3d="http://schemas.microsoft.com/office/drawing/2017/model3d" xmlns:o="urn:schemas-microsoft-com:office:office" xmlns:oel="http://schemas.microsoft.com/office/2019/extlst" xmlns:r="http://schemas.openxmlformats.org/officeDocument/2006/relationships" xmlns:m="http://schemas.openxmlformats.org/officeDocument/2006/math" xmlns:v="urn:schemas-microsoft-com:vml" xmlns:wp14="http://schemas.microsoft.com/office/word/2010/wordprocessingDrawing" xmlns:wp="http://schemas.openxmlformats.org/drawingml/2006/wordprocessingDrawing" xmlns:w10="urn:schemas-microsoft-com:office:word" xmlns:w="http://schemas.openxmlformats.org/wordprocessingml/2006/main" xmlns:w14="http://schemas.microsoft.com/office/word/2010/wordml" xmlns:w15="http://schemas.microsoft.com/office/word/2012/wordml" xmlns:w16cex="http://schemas.microsoft.com/office/word/2018/wordml/cex" xmlns:w16cid="http://schemas.microsoft.com/office/word/2016/wordml/cid" xmlns:w16="http://schemas.microsoft.com/office/word/2018/wordml" xmlns:w16sdtdh="http://schemas.microsoft.com/office/word/2020/wordml/sdtdatahash" xmlns:w16se="http://schemas.microsoft.com/office/word/2015/wordml/symex" xmlns:wpg="http://schemas.microsoft.com/office/word/2010/wordprocessingGroup" xmlns:wpi="http://schemas.microsoft.com/office/word/2010/wordprocessingInk" xmlns:wne="http://schemas.microsoft.com/office/word/2006/wordml" xmlns:wps="http://schemas.microsoft.com/office/word/2010/wordprocessingShape" mc:Ignorable="w14 w15 w16se w16cid w16 w16cex w16sdtdh wp14">
   <w:endnote w:type="separator" w:id="-1">
     <w:p>
       <w:pPr>
@@ -158,7 +233,7 @@
 </file>
 
 <file path=word/footnotes.xml><?xml version="1.0" encoding="utf-8"?>
-<w:footnotes xmlns:wpc="http://schemas.microsoft.com/office/word/2010/wordprocessingCanvas" xmlns:cx="http://schemas.microsoft.com/office/drawing/2014/chartex" xmlns:cx1="http://schemas.microsoft.com/office/drawing/2015/9/8/chartex" xmlns:cx2="http://schemas.microsoft.com/office/drawing/2015/10/21/chartex" xmlns:cx3="http://schemas.microsoft.com/office/drawing/2016/5/9/chartex" xmlns:cx4="http://schemas.microsoft.com/office/drawing/2016/5/10/chartex" xmlns:cx5="http://schemas.microsoft.com/office/drawing/2016/5/11/chartex" xmlns:cx6="http://schemas.microsoft.com/office/drawing/2016/5/12/chartex" xmlns:cx7="http://schemas.microsoft.com/office/drawing/2016/5/13/chartex" xmlns:cx8="http://schemas.microsoft.com/office/drawing/2016/5/14/chartex" xmlns:mc="http://schemas.openxmlformats.org/markup-compatibility/2006" xmlns:aink="http://schemas.microsoft.com/office/drawing/2016/ink" xmlns:am3d="http://schemas.microsoft.com/office/drawing/2017/model3d" xmlns:o="urn:schemas-microsoft-com:office:office" xmlns:oel="http://schemas.microsoft.com/office/2019/extlst" xmlns:r="http://schemas.openxmlformats.org/officeDocument/2006/relationships" xmlns:m="http://schemas.openxmlformats.org/officeDocument/2006/math" xmlns:v="urn:schemas-microsoft-com:vml" xmlns:wp14="http://schemas.microsoft.com/office/word/2010/wordprocessingDrawing" xmlns:wp="http://schemas.openxmlformats.org/drawingml/2006/wordprocessingDrawing" xmlns:w10="urn:schemas-microsoft-com:office:word" xmlns:w="http://schemas.openxmlformats.org/wordprocessingml/2006/main" xmlns:w14="http://schemas.microsoft.com/office/word/2010/wordml" xmlns:w15="http://schemas.microsoft.com/office/word/2012/wordml" xmlns:w16cex="http://schemas.microsoft.com/office/word/2018/wordml/cex" xmlns:w16cid="http://schemas.microsoft.com/office/word/2016/wordml/cid" xmlns:w16="http://schemas.microsoft.com/office/word/2018/wordml" xmlns:w16du="http://schemas.microsoft.com/office/word/2023/wordml/word16du" xmlns:w16sdtdh="http://schemas.microsoft.com/office/word/2020/wordml/sdtdatahash" xmlns:w16sdtfl="http://schemas.microsoft.com/office/word/2024/wordml/sdtformatlock" xmlns:w16se="http://schemas.microsoft.com/office/word/2015/wordml/symex" xmlns:wpg="http://schemas.microsoft.com/office/word/2010/wordprocessingGroup" xmlns:wpi="http://schemas.microsoft.com/office/word/2010/wordprocessingInk" xmlns:wne="http://schemas.microsoft.com/office/word/2006/wordml" xmlns:wps="http://schemas.microsoft.com/office/word/2010/wordprocessingShape" mc:Ignorable="w14 w15 w16se w16cid w16 w16cex w16sdtdh w16sdtfl w16du wp14">
+<w:footnotes xmlns:wpc="http://schemas.microsoft.com/office/word/2010/wordprocessingCanvas" xmlns:cx="http://schemas.microsoft.com/office/drawing/2014/chartex" xmlns:cx1="http://schemas.microsoft.com/office/drawing/2015/9/8/chartex" xmlns:cx2="http://schemas.microsoft.com/office/drawing/2015/10/21/chartex" xmlns:cx3="http://schemas.microsoft.com/office/drawing/2016/5/9/chartex" xmlns:cx4="http://schemas.microsoft.com/office/drawing/2016/5/10/chartex" xmlns:cx5="http://schemas.microsoft.com/office/drawing/2016/5/11/chartex" xmlns:cx6="http://schemas.microsoft.com/office/drawing/2016/5/12/chartex" xmlns:cx7="http://schemas.microsoft.com/office/drawing/2016/5/13/chartex" xmlns:cx8="http://schemas.microsoft.com/office/drawing/2016/5/14/chartex" xmlns:mc="http://schemas.openxmlformats.org/markup-compatibility/2006" xmlns:aink="http://schemas.microsoft.com/office/drawing/2016/ink" xmlns:am3d="http://schemas.microsoft.com/office/drawing/2017/model3d" xmlns:o="urn:schemas-microsoft-com:office:office" xmlns:oel="http://schemas.microsoft.com/office/2019/extlst" xmlns:r="http://schemas.openxmlformats.org/officeDocument/2006/relationships" xmlns:m="http://schemas.openxmlformats.org/officeDocument/2006/math" xmlns:v="urn:schemas-microsoft-com:vml" xmlns:wp14="http://schemas.microsoft.com/office/word/2010/wordprocessingDrawing" xmlns:wp="http://schemas.openxmlformats.org/drawingml/2006/wordprocessingDrawing" xmlns:w10="urn:schemas-microsoft-com:office:word" xmlns:w="http://schemas.openxmlformats.org/wordprocessingml/2006/main" xmlns:w14="http://schemas.microsoft.com/office/word/2010/wordml" xmlns:w15="http://schemas.microsoft.com/office/word/2012/wordml" xmlns:w16cex="http://schemas.microsoft.com/office/word/2018/wordml/cex" xmlns:w16cid="http://schemas.microsoft.com/office/word/2016/wordml/cid" xmlns:w16="http://schemas.microsoft.com/office/word/2018/wordml" xmlns:w16sdtdh="http://schemas.microsoft.com/office/word/2020/wordml/sdtdatahash" xmlns:w16se="http://schemas.microsoft.com/office/word/2015/wordml/symex" xmlns:wpg="http://schemas.microsoft.com/office/word/2010/wordprocessingGroup" xmlns:wpi="http://schemas.microsoft.com/office/word/2010/wordprocessingInk" xmlns:wne="http://schemas.microsoft.com/office/word/2006/wordml" xmlns:wps="http://schemas.microsoft.com/office/word/2010/wordprocessingShape" mc:Ignorable="w14 w15 w16se w16cid w16 w16cex w16sdtdh wp14">
   <w:footnote w:type="separator" w:id="-1">
     <w:p>
       <w:pPr>
@@ -183,7 +258,7 @@
 </file>
 
 <file path=word/styles.xml><?xml version="1.0" encoding="utf-8"?>
-<w:styles xmlns:mc="http://schemas.openxmlformats.org/markup-compatibility/2006" xmlns:r="http://schemas.openxmlformats.org/officeDocument/2006/relationships" xmlns:w="http://schemas.openxmlformats.org/wordprocessingml/2006/main" xmlns:w14="http://schemas.microsoft.com/office/word/2010/wordml" xmlns:w15="http://schemas.microsoft.com/office/word/2012/wordml" xmlns:w16cex="http://schemas.microsoft.com/office/word/2018/wordml/cex" xmlns:w16cid="http://schemas.microsoft.com/office/word/2016/wordml/cid" xmlns:w16="http://schemas.microsoft.com/office/word/2018/wordml" xmlns:w16du="http://schemas.microsoft.com/office/word/2023/wordml/word16du" xmlns:w16sdtdh="http://schemas.microsoft.com/office/word/2020/wordml/sdtdatahash" xmlns:w16sdtfl="http://schemas.microsoft.com/office/word/2024/wordml/sdtformatlock" xmlns:w16se="http://schemas.microsoft.com/office/word/2015/wordml/symex" mc:Ignorable="w14 w15 w16se w16cid w16 w16cex w16sdtdh w16sdtfl w16du">
+<w:styles xmlns:mc="http://schemas.openxmlformats.org/markup-compatibility/2006" xmlns:r="http://schemas.openxmlformats.org/officeDocument/2006/relationships" xmlns:w="http://schemas.openxmlformats.org/wordprocessingml/2006/main" xmlns:w14="http://schemas.microsoft.com/office/word/2010/wordml" xmlns:w15="http://schemas.microsoft.com/office/word/2012/wordml" xmlns:w16cex="http://schemas.microsoft.com/office/word/2018/wordml/cex" xmlns:w16cid="http://schemas.microsoft.com/office/word/2016/wordml/cid" xmlns:w16="http://schemas.microsoft.com/office/word/2018/wordml" xmlns:w16sdtdh="http://schemas.microsoft.com/office/word/2020/wordml/sdtdatahash" xmlns:w16se="http://schemas.microsoft.com/office/word/2015/wordml/symex" mc:Ignorable="w14 w15 w16se w16cid w16 w16cex w16sdtdh">
   <w:docDefaults>
     <w:rPrDefault>
       <w:rPr>

</xml_diff>

<commit_message>
casos de uso y archivo costos
</commit_message>
<xml_diff>
--- a/trimestre 2/FIGMA.docx
+++ b/trimestre 2/FIGMA.docx
@@ -1,6 +1,6 @@
 
 <file path=word/document.xml><?xml version="1.0" encoding="utf-8"?>
-<w:document xmlns:wpc="http://schemas.microsoft.com/office/word/2010/wordprocessingCanvas" xmlns:cx="http://schemas.microsoft.com/office/drawing/2014/chartex" xmlns:cx1="http://schemas.microsoft.com/office/drawing/2015/9/8/chartex" xmlns:cx2="http://schemas.microsoft.com/office/drawing/2015/10/21/chartex" xmlns:cx3="http://schemas.microsoft.com/office/drawing/2016/5/9/chartex" xmlns:cx4="http://schemas.microsoft.com/office/drawing/2016/5/10/chartex" xmlns:cx5="http://schemas.microsoft.com/office/drawing/2016/5/11/chartex" xmlns:cx6="http://schemas.microsoft.com/office/drawing/2016/5/12/chartex" xmlns:cx7="http://schemas.microsoft.com/office/drawing/2016/5/13/chartex" xmlns:cx8="http://schemas.microsoft.com/office/drawing/2016/5/14/chartex" xmlns:mc="http://schemas.openxmlformats.org/markup-compatibility/2006" xmlns:aink="http://schemas.microsoft.com/office/drawing/2016/ink" xmlns:am3d="http://schemas.microsoft.com/office/drawing/2017/model3d" xmlns:o="urn:schemas-microsoft-com:office:office" xmlns:oel="http://schemas.microsoft.com/office/2019/extlst" xmlns:r="http://schemas.openxmlformats.org/officeDocument/2006/relationships" xmlns:m="http://schemas.openxmlformats.org/officeDocument/2006/math" xmlns:v="urn:schemas-microsoft-com:vml" xmlns:wp14="http://schemas.microsoft.com/office/word/2010/wordprocessingDrawing" xmlns:wp="http://schemas.openxmlformats.org/drawingml/2006/wordprocessingDrawing" xmlns:w10="urn:schemas-microsoft-com:office:word" xmlns:w="http://schemas.openxmlformats.org/wordprocessingml/2006/main" xmlns:w14="http://schemas.microsoft.com/office/word/2010/wordml" xmlns:w15="http://schemas.microsoft.com/office/word/2012/wordml" xmlns:w16cex="http://schemas.microsoft.com/office/word/2018/wordml/cex" xmlns:w16cid="http://schemas.microsoft.com/office/word/2016/wordml/cid" xmlns:w16="http://schemas.microsoft.com/office/word/2018/wordml" xmlns:w16du="http://schemas.microsoft.com/office/word/2023/wordml/word16du" xmlns:w16sdtdh="http://schemas.microsoft.com/office/word/2020/wordml/sdtdatahash" xmlns:w16sdtfl="http://schemas.microsoft.com/office/word/2024/wordml/sdtformatlock" xmlns:w16se="http://schemas.microsoft.com/office/word/2015/wordml/symex" xmlns:wpg="http://schemas.microsoft.com/office/word/2010/wordprocessingGroup" xmlns:wpi="http://schemas.microsoft.com/office/word/2010/wordprocessingInk" xmlns:wne="http://schemas.microsoft.com/office/word/2006/wordml" xmlns:wps="http://schemas.microsoft.com/office/word/2010/wordprocessingShape" mc:Ignorable="w14 w15 w16se w16cid w16 w16cex w16sdtdh w16sdtfl w16du wp14">
+<w:document xmlns:wpc="http://schemas.microsoft.com/office/word/2010/wordprocessingCanvas" xmlns:cx="http://schemas.microsoft.com/office/drawing/2014/chartex" xmlns:cx1="http://schemas.microsoft.com/office/drawing/2015/9/8/chartex" xmlns:cx2="http://schemas.microsoft.com/office/drawing/2015/10/21/chartex" xmlns:cx3="http://schemas.microsoft.com/office/drawing/2016/5/9/chartex" xmlns:cx4="http://schemas.microsoft.com/office/drawing/2016/5/10/chartex" xmlns:cx5="http://schemas.microsoft.com/office/drawing/2016/5/11/chartex" xmlns:cx6="http://schemas.microsoft.com/office/drawing/2016/5/12/chartex" xmlns:cx7="http://schemas.microsoft.com/office/drawing/2016/5/13/chartex" xmlns:cx8="http://schemas.microsoft.com/office/drawing/2016/5/14/chartex" xmlns:mc="http://schemas.openxmlformats.org/markup-compatibility/2006" xmlns:aink="http://schemas.microsoft.com/office/drawing/2016/ink" xmlns:am3d="http://schemas.microsoft.com/office/drawing/2017/model3d" xmlns:o="urn:schemas-microsoft-com:office:office" xmlns:oel="http://schemas.microsoft.com/office/2019/extlst" xmlns:r="http://schemas.openxmlformats.org/officeDocument/2006/relationships" xmlns:m="http://schemas.openxmlformats.org/officeDocument/2006/math" xmlns:v="urn:schemas-microsoft-com:vml" xmlns:wp14="http://schemas.microsoft.com/office/word/2010/wordprocessingDrawing" xmlns:wp="http://schemas.openxmlformats.org/drawingml/2006/wordprocessingDrawing" xmlns:w10="urn:schemas-microsoft-com:office:word" xmlns:w="http://schemas.openxmlformats.org/wordprocessingml/2006/main" xmlns:w14="http://schemas.microsoft.com/office/word/2010/wordml" xmlns:w15="http://schemas.microsoft.com/office/word/2012/wordml" xmlns:w16cex="http://schemas.microsoft.com/office/word/2018/wordml/cex" xmlns:w16cid="http://schemas.microsoft.com/office/word/2016/wordml/cid" xmlns:w16="http://schemas.microsoft.com/office/word/2018/wordml" xmlns:w16sdtdh="http://schemas.microsoft.com/office/word/2020/wordml/sdtdatahash" xmlns:w16se="http://schemas.microsoft.com/office/word/2015/wordml/symex" xmlns:wpg="http://schemas.microsoft.com/office/word/2010/wordprocessingGroup" xmlns:wpi="http://schemas.microsoft.com/office/word/2010/wordprocessingInk" xmlns:wne="http://schemas.microsoft.com/office/word/2006/wordml" xmlns:wps="http://schemas.microsoft.com/office/word/2010/wordprocessingShape" mc:Ignorable="w14 w15 w16se w16cid w16 w16cex w16sdtdh wp14">
   <w:body>
     <w:p>
       <w:pPr>
@@ -90,6 +90,7 @@
     <w:p>
       <w:pPr>
         <w:rPr>
+          <w:rStyle w:val="Hipervnculo"/>
           <w:b/>
           <w:bCs/>
         </w:rPr>
@@ -111,6 +112,80 @@
           <w:t>https://www.figma.com/make/x1ggvgw2lrvoCOx5JtN7se/Agregar-calendario-de-citas?t=iFkfQSNzYofEfUHE-1</w:t>
         </w:r>
       </w:hyperlink>
+    </w:p>
+    <w:p>
+      <w:pPr>
+        <w:rPr>
+          <w:b/>
+          <w:bCs/>
+        </w:rPr>
+      </w:pPr>
+    </w:p>
+    <w:p>
+      <w:pPr>
+        <w:rPr>
+          <w:b/>
+          <w:bCs/>
+        </w:rPr>
+      </w:pPr>
+      <w:r>
+        <w:rPr>
+          <w:b/>
+          <w:bCs/>
+        </w:rPr>
+        <w:t xml:space="preserve">12 de </w:t>
+      </w:r>
+      <w:proofErr w:type="gramStart"/>
+      <w:r>
+        <w:rPr>
+          <w:b/>
+          <w:bCs/>
+        </w:rPr>
+        <w:t>Marzo</w:t>
+      </w:r>
+      <w:proofErr w:type="gramEnd"/>
+      <w:r>
+        <w:rPr>
+          <w:b/>
+          <w:bCs/>
+        </w:rPr>
+        <w:t xml:space="preserve"> de 2026</w:t>
+      </w:r>
+    </w:p>
+    <w:p>
+      <w:r>
+        <w:t>Se le modifico apariencia al logo</w:t>
+      </w:r>
+      <w:r>
+        <w:t>,</w:t>
+      </w:r>
+      <w:r>
+        <w:t xml:space="preserve"> transparencia y color. </w:t>
+      </w:r>
+    </w:p>
+    <w:p>
+      <w:pPr>
+        <w:rPr>
+          <w:b/>
+          <w:bCs/>
+        </w:rPr>
+      </w:pPr>
+      <w:r>
+        <w:rPr>
+          <w:b/>
+          <w:bCs/>
+        </w:rPr>
+        <w:t xml:space="preserve">URL:  </w:t>
+      </w:r>
+      <w:r>
+        <w:rPr>
+          <w:b/>
+          <w:bCs/>
+          <w:color w:val="0070C0"/>
+          <w:u w:val="single"/>
+        </w:rPr>
+        <w:t>https://www.figma.com/make/x1ggvgw2lrvoCOx5JtN7se/Agregar-calendario-de-citas?p=f&amp;t=91GrGoK9tRBytdE5-0</w:t>
+      </w:r>
     </w:p>
     <w:p>
       <w:pPr>
@@ -133,7 +208,7 @@
 </file>
 
 <file path=word/endnotes.xml><?xml version="1.0" encoding="utf-8"?>
-<w:endnotes xmlns:wpc="http://schemas.microsoft.com/office/word/2010/wordprocessingCanvas" xmlns:cx="http://schemas.microsoft.com/office/drawing/2014/chartex" xmlns:cx1="http://schemas.microsoft.com/office/drawing/2015/9/8/chartex" xmlns:cx2="http://schemas.microsoft.com/office/drawing/2015/10/21/chartex" xmlns:cx3="http://schemas.microsoft.com/office/drawing/2016/5/9/chartex" xmlns:cx4="http://schemas.microsoft.com/office/drawing/2016/5/10/chartex" xmlns:cx5="http://schemas.microsoft.com/office/drawing/2016/5/11/chartex" xmlns:cx6="http://schemas.microsoft.com/office/drawing/2016/5/12/chartex" xmlns:cx7="http://schemas.microsoft.com/office/drawing/2016/5/13/chartex" xmlns:cx8="http://schemas.microsoft.com/office/drawing/2016/5/14/chartex" xmlns:mc="http://schemas.openxmlformats.org/markup-compatibility/2006" xmlns:aink="http://schemas.microsoft.com/office/drawing/2016/ink" xmlns:am3d="http://schemas.microsoft.com/office/drawing/2017/model3d" xmlns:o="urn:schemas-microsoft-com:office:office" xmlns:oel="http://schemas.microsoft.com/office/2019/extlst" xmlns:r="http://schemas.openxmlformats.org/officeDocument/2006/relationships" xmlns:m="http://schemas.openxmlformats.org/officeDocument/2006/math" xmlns:v="urn:schemas-microsoft-com:vml" xmlns:wp14="http://schemas.microsoft.com/office/word/2010/wordprocessingDrawing" xmlns:wp="http://schemas.openxmlformats.org/drawingml/2006/wordprocessingDrawing" xmlns:w10="urn:schemas-microsoft-com:office:word" xmlns:w="http://schemas.openxmlformats.org/wordprocessingml/2006/main" xmlns:w14="http://schemas.microsoft.com/office/word/2010/wordml" xmlns:w15="http://schemas.microsoft.com/office/word/2012/wordml" xmlns:w16cex="http://schemas.microsoft.com/office/word/2018/wordml/cex" xmlns:w16cid="http://schemas.microsoft.com/office/word/2016/wordml/cid" xmlns:w16="http://schemas.microsoft.com/office/word/2018/wordml" xmlns:w16du="http://schemas.microsoft.com/office/word/2023/wordml/word16du" xmlns:w16sdtdh="http://schemas.microsoft.com/office/word/2020/wordml/sdtdatahash" xmlns:w16sdtfl="http://schemas.microsoft.com/office/word/2024/wordml/sdtformatlock" xmlns:w16se="http://schemas.microsoft.com/office/word/2015/wordml/symex" xmlns:wpg="http://schemas.microsoft.com/office/word/2010/wordprocessingGroup" xmlns:wpi="http://schemas.microsoft.com/office/word/2010/wordprocessingInk" xmlns:wne="http://schemas.microsoft.com/office/word/2006/wordml" xmlns:wps="http://schemas.microsoft.com/office/word/2010/wordprocessingShape" mc:Ignorable="w14 w15 w16se w16cid w16 w16cex w16sdtdh w16sdtfl w16du wp14">
+<w:endnotes xmlns:wpc="http://schemas.microsoft.com/office/word/2010/wordprocessingCanvas" xmlns:cx="http://schemas.microsoft.com/office/drawing/2014/chartex" xmlns:cx1="http://schemas.microsoft.com/office/drawing/2015/9/8/chartex" xmlns:cx2="http://schemas.microsoft.com/office/drawing/2015/10/21/chartex" xmlns:cx3="http://schemas.microsoft.com/office/drawing/2016/5/9/chartex" xmlns:cx4="http://schemas.microsoft.com/office/drawing/2016/5/10/chartex" xmlns:cx5="http://schemas.microsoft.com/office/drawing/2016/5/11/chartex" xmlns:cx6="http://schemas.microsoft.com/office/drawing/2016/5/12/chartex" xmlns:cx7="http://schemas.microsoft.com/office/drawing/2016/5/13/chartex" xmlns:cx8="http://schemas.microsoft.com/office/drawing/2016/5/14/chartex" xmlns:mc="http://schemas.openxmlformats.org/markup-compatibility/2006" xmlns:aink="http://schemas.microsoft.com/office/drawing/2016/ink" xmlns:am3d="http://schemas.microsoft.com/office/drawing/2017/model3d" xmlns:o="urn:schemas-microsoft-com:office:office" xmlns:oel="http://schemas.microsoft.com/office/2019/extlst" xmlns:r="http://schemas.openxmlformats.org/officeDocument/2006/relationships" xmlns:m="http://schemas.openxmlformats.org/officeDocument/2006/math" xmlns:v="urn:schemas-microsoft-com:vml" xmlns:wp14="http://schemas.microsoft.com/office/word/2010/wordprocessingDrawing" xmlns:wp="http://schemas.openxmlformats.org/drawingml/2006/wordprocessingDrawing" xmlns:w10="urn:schemas-microsoft-com:office:word" xmlns:w="http://schemas.openxmlformats.org/wordprocessingml/2006/main" xmlns:w14="http://schemas.microsoft.com/office/word/2010/wordml" xmlns:w15="http://schemas.microsoft.com/office/word/2012/wordml" xmlns:w16cex="http://schemas.microsoft.com/office/word/2018/wordml/cex" xmlns:w16cid="http://schemas.microsoft.com/office/word/2016/wordml/cid" xmlns:w16="http://schemas.microsoft.com/office/word/2018/wordml" xmlns:w16sdtdh="http://schemas.microsoft.com/office/word/2020/wordml/sdtdatahash" xmlns:w16se="http://schemas.microsoft.com/office/word/2015/wordml/symex" xmlns:wpg="http://schemas.microsoft.com/office/word/2010/wordprocessingGroup" xmlns:wpi="http://schemas.microsoft.com/office/word/2010/wordprocessingInk" xmlns:wne="http://schemas.microsoft.com/office/word/2006/wordml" xmlns:wps="http://schemas.microsoft.com/office/word/2010/wordprocessingShape" mc:Ignorable="w14 w15 w16se w16cid w16 w16cex w16sdtdh wp14">
   <w:endnote w:type="separator" w:id="-1">
     <w:p>
       <w:pPr>
@@ -158,7 +233,7 @@
 </file>
 
 <file path=word/footnotes.xml><?xml version="1.0" encoding="utf-8"?>
-<w:footnotes xmlns:wpc="http://schemas.microsoft.com/office/word/2010/wordprocessingCanvas" xmlns:cx="http://schemas.microsoft.com/office/drawing/2014/chartex" xmlns:cx1="http://schemas.microsoft.com/office/drawing/2015/9/8/chartex" xmlns:cx2="http://schemas.microsoft.com/office/drawing/2015/10/21/chartex" xmlns:cx3="http://schemas.microsoft.com/office/drawing/2016/5/9/chartex" xmlns:cx4="http://schemas.microsoft.com/office/drawing/2016/5/10/chartex" xmlns:cx5="http://schemas.microsoft.com/office/drawing/2016/5/11/chartex" xmlns:cx6="http://schemas.microsoft.com/office/drawing/2016/5/12/chartex" xmlns:cx7="http://schemas.microsoft.com/office/drawing/2016/5/13/chartex" xmlns:cx8="http://schemas.microsoft.com/office/drawing/2016/5/14/chartex" xmlns:mc="http://schemas.openxmlformats.org/markup-compatibility/2006" xmlns:aink="http://schemas.microsoft.com/office/drawing/2016/ink" xmlns:am3d="http://schemas.microsoft.com/office/drawing/2017/model3d" xmlns:o="urn:schemas-microsoft-com:office:office" xmlns:oel="http://schemas.microsoft.com/office/2019/extlst" xmlns:r="http://schemas.openxmlformats.org/officeDocument/2006/relationships" xmlns:m="http://schemas.openxmlformats.org/officeDocument/2006/math" xmlns:v="urn:schemas-microsoft-com:vml" xmlns:wp14="http://schemas.microsoft.com/office/word/2010/wordprocessingDrawing" xmlns:wp="http://schemas.openxmlformats.org/drawingml/2006/wordprocessingDrawing" xmlns:w10="urn:schemas-microsoft-com:office:word" xmlns:w="http://schemas.openxmlformats.org/wordprocessingml/2006/main" xmlns:w14="http://schemas.microsoft.com/office/word/2010/wordml" xmlns:w15="http://schemas.microsoft.com/office/word/2012/wordml" xmlns:w16cex="http://schemas.microsoft.com/office/word/2018/wordml/cex" xmlns:w16cid="http://schemas.microsoft.com/office/word/2016/wordml/cid" xmlns:w16="http://schemas.microsoft.com/office/word/2018/wordml" xmlns:w16du="http://schemas.microsoft.com/office/word/2023/wordml/word16du" xmlns:w16sdtdh="http://schemas.microsoft.com/office/word/2020/wordml/sdtdatahash" xmlns:w16sdtfl="http://schemas.microsoft.com/office/word/2024/wordml/sdtformatlock" xmlns:w16se="http://schemas.microsoft.com/office/word/2015/wordml/symex" xmlns:wpg="http://schemas.microsoft.com/office/word/2010/wordprocessingGroup" xmlns:wpi="http://schemas.microsoft.com/office/word/2010/wordprocessingInk" xmlns:wne="http://schemas.microsoft.com/office/word/2006/wordml" xmlns:wps="http://schemas.microsoft.com/office/word/2010/wordprocessingShape" mc:Ignorable="w14 w15 w16se w16cid w16 w16cex w16sdtdh w16sdtfl w16du wp14">
+<w:footnotes xmlns:wpc="http://schemas.microsoft.com/office/word/2010/wordprocessingCanvas" xmlns:cx="http://schemas.microsoft.com/office/drawing/2014/chartex" xmlns:cx1="http://schemas.microsoft.com/office/drawing/2015/9/8/chartex" xmlns:cx2="http://schemas.microsoft.com/office/drawing/2015/10/21/chartex" xmlns:cx3="http://schemas.microsoft.com/office/drawing/2016/5/9/chartex" xmlns:cx4="http://schemas.microsoft.com/office/drawing/2016/5/10/chartex" xmlns:cx5="http://schemas.microsoft.com/office/drawing/2016/5/11/chartex" xmlns:cx6="http://schemas.microsoft.com/office/drawing/2016/5/12/chartex" xmlns:cx7="http://schemas.microsoft.com/office/drawing/2016/5/13/chartex" xmlns:cx8="http://schemas.microsoft.com/office/drawing/2016/5/14/chartex" xmlns:mc="http://schemas.openxmlformats.org/markup-compatibility/2006" xmlns:aink="http://schemas.microsoft.com/office/drawing/2016/ink" xmlns:am3d="http://schemas.microsoft.com/office/drawing/2017/model3d" xmlns:o="urn:schemas-microsoft-com:office:office" xmlns:oel="http://schemas.microsoft.com/office/2019/extlst" xmlns:r="http://schemas.openxmlformats.org/officeDocument/2006/relationships" xmlns:m="http://schemas.openxmlformats.org/officeDocument/2006/math" xmlns:v="urn:schemas-microsoft-com:vml" xmlns:wp14="http://schemas.microsoft.com/office/word/2010/wordprocessingDrawing" xmlns:wp="http://schemas.openxmlformats.org/drawingml/2006/wordprocessingDrawing" xmlns:w10="urn:schemas-microsoft-com:office:word" xmlns:w="http://schemas.openxmlformats.org/wordprocessingml/2006/main" xmlns:w14="http://schemas.microsoft.com/office/word/2010/wordml" xmlns:w15="http://schemas.microsoft.com/office/word/2012/wordml" xmlns:w16cex="http://schemas.microsoft.com/office/word/2018/wordml/cex" xmlns:w16cid="http://schemas.microsoft.com/office/word/2016/wordml/cid" xmlns:w16="http://schemas.microsoft.com/office/word/2018/wordml" xmlns:w16sdtdh="http://schemas.microsoft.com/office/word/2020/wordml/sdtdatahash" xmlns:w16se="http://schemas.microsoft.com/office/word/2015/wordml/symex" xmlns:wpg="http://schemas.microsoft.com/office/word/2010/wordprocessingGroup" xmlns:wpi="http://schemas.microsoft.com/office/word/2010/wordprocessingInk" xmlns:wne="http://schemas.microsoft.com/office/word/2006/wordml" xmlns:wps="http://schemas.microsoft.com/office/word/2010/wordprocessingShape" mc:Ignorable="w14 w15 w16se w16cid w16 w16cex w16sdtdh wp14">
   <w:footnote w:type="separator" w:id="-1">
     <w:p>
       <w:pPr>
@@ -183,7 +258,7 @@
 </file>
 
 <file path=word/styles.xml><?xml version="1.0" encoding="utf-8"?>
-<w:styles xmlns:mc="http://schemas.openxmlformats.org/markup-compatibility/2006" xmlns:r="http://schemas.openxmlformats.org/officeDocument/2006/relationships" xmlns:w="http://schemas.openxmlformats.org/wordprocessingml/2006/main" xmlns:w14="http://schemas.microsoft.com/office/word/2010/wordml" xmlns:w15="http://schemas.microsoft.com/office/word/2012/wordml" xmlns:w16cex="http://schemas.microsoft.com/office/word/2018/wordml/cex" xmlns:w16cid="http://schemas.microsoft.com/office/word/2016/wordml/cid" xmlns:w16="http://schemas.microsoft.com/office/word/2018/wordml" xmlns:w16du="http://schemas.microsoft.com/office/word/2023/wordml/word16du" xmlns:w16sdtdh="http://schemas.microsoft.com/office/word/2020/wordml/sdtdatahash" xmlns:w16sdtfl="http://schemas.microsoft.com/office/word/2024/wordml/sdtformatlock" xmlns:w16se="http://schemas.microsoft.com/office/word/2015/wordml/symex" mc:Ignorable="w14 w15 w16se w16cid w16 w16cex w16sdtdh w16sdtfl w16du">
+<w:styles xmlns:mc="http://schemas.openxmlformats.org/markup-compatibility/2006" xmlns:r="http://schemas.openxmlformats.org/officeDocument/2006/relationships" xmlns:w="http://schemas.openxmlformats.org/wordprocessingml/2006/main" xmlns:w14="http://schemas.microsoft.com/office/word/2010/wordml" xmlns:w15="http://schemas.microsoft.com/office/word/2012/wordml" xmlns:w16cex="http://schemas.microsoft.com/office/word/2018/wordml/cex" xmlns:w16cid="http://schemas.microsoft.com/office/word/2016/wordml/cid" xmlns:w16="http://schemas.microsoft.com/office/word/2018/wordml" xmlns:w16sdtdh="http://schemas.microsoft.com/office/word/2020/wordml/sdtdatahash" xmlns:w16se="http://schemas.microsoft.com/office/word/2015/wordml/symex" mc:Ignorable="w14 w15 w16se w16cid w16 w16cex w16sdtdh">
   <w:docDefaults>
     <w:rPrDefault>
       <w:rPr>

</xml_diff>